<commit_message>
Remove requested final changelog section from roadmap reader and attachments
</commit_message>
<xml_diff>
--- a/investor-65m-2026-10-04/assets/documents/tz-roadmap-v2-2026-10-06.docx
+++ b/investor-65m-2026-10-04/assets/documents/tz-roadmap-v2-2026-10-06.docx
@@ -12624,50 +12624,6 @@
           <w:b w:val="0"/>
         </w:rPr>
         <w:t>Сметы на неоценённые работы, решение по TATRA за 2,5 млн и реестр срочного долга на 5 млн. Затем единый календарь платежей, без дублирования покупок, аренды и передаваемой техники.</w:t>
-      </w:r>
-    </w:p>
-    <w:p>
-      <w:pPr>
-        <w:pStyle w:val="Heading2"/>
-      </w:pPr>
-      <w:r>
-        <w:t>Что изменилось по сравнению с прежним ТЗ</w:t>
-      </w:r>
-    </w:p>
-    <w:p>
-      <w:r>
-        <w:rPr>
-          <w:b w:val="0"/>
-          <w:sz w:val="18"/>
-        </w:rPr>
-        <w:t>Две покупаемые офисные бытовки заменены арендой шести с распределением по функциям и мебелью. Итоговое количество 6 подтверждено; прежняя строка про 2 больше не действует.</w:t>
-      </w:r>
-    </w:p>
-    <w:p>
-      <w:r>
-        <w:rPr>
-          <w:b w:val="0"/>
-          <w:sz w:val="18"/>
-        </w:rPr>
-        <w:t>Добавлены Hitachi 450 с ковшом 2,5 м³, бульдозер 20 т и три самосвала. Прежние варианты нового лизинга и покупок не начисляются поверх добавленного парка.</w:t>
-      </w:r>
-    </w:p>
-    <w:p>
-      <w:r>
-        <w:rPr>
-          <w:b w:val="0"/>
-          <w:sz w:val="18"/>
-        </w:rPr>
-        <w:t>Добавлены перенос городка и ремонтной зоны, новые площадки, первичный бюджет 42,97 млн руб. и отдельные задания на оценку недостающих работ.</w:t>
-      </w:r>
-    </w:p>
-    <w:p>
-      <w:r>
-        <w:rPr>
-          <w:b w:val="0"/>
-          <w:sz w:val="18"/>
-        </w:rPr>
-        <w:t>Срочный долг 5 млн руб. вынесен в обязательную проверку и календарь оплаты. Дополнительная TATRA оставлена отдельным решением. Цели производства не повышены без испытаний.</w:t>
       </w:r>
     </w:p>
     <w:sectPr>

</xml_diff>